<commit_message>
PAUSED (task151): stage 4 repair green, FIN-14 4.4 look-back filed, golden re-derived to $4,250,000, waiting on the re-judge
Judge round 1 (NOT_DETERMINISTIC, no filed preference among the bases) and the rule 3 audit's strength finding repaired
inside architecture 1: FIN-14 4.4 files a look-back selection criterion naming no method; the starting nines' raw
seasons now miss by 1.53 to 1.77 bins on every window; 4.3 restated, Ask B's population and attribution filed, one
rounding path, Ask A's effective date filed, the close-file index renamed; world redrawn (seed 1539). checks 276,
verify, two byte-identical builds, figures_check 87, precut 49, voice-check, container audit, leak.py REVIEW.

Co-Authored-By: Claude Opus 5.5 <noreply@anthropic.com>
Claude-Session: https://claude.ai/code/session_01A6XcFx5t62c7gPi1bBKcVi
</commit_message>
<xml_diff>
--- a/task151/golden/pa_bonus_accrual_memo_2027.docx
+++ b/task151/golden/pa_bonus_accrual_memo_2027.docx
@@ -46,7 +46,7 @@
     <w:p/>
     <w:p>
       <w:r>
-        <w:t>We accrue $3,500,000 at signing for the plate-appearance bonuses in the 2027 contracts of the five free-agent hitters signed between November 24 and December 10, 2026. Each bonus is accrued at its expected amount under FIN-14 4.2 and 4.3: the bonus times the probability, at the signing date, that the player reaches its threshold in the 2027 championship season, with the player in the lineup slot Baseball Operations plans for him.</w:t>
+        <w:t>We accrue $4,250,000 at signing for the plate-appearance bonuses in the 2027 contracts of the five free-agent hitters signed between November 24 and December 10, 2026. Each bonus is accrued at its expected amount under FIN-14 4.2 and 4.3: the bonus times the probability, at the signing date, that the player reaches its threshold in the 2027 championship season, with the player in the lineup slot Baseball Operations plans for him.</w:t>
       </w:r>
     </w:p>
     <w:tbl>
@@ -113,7 +113,7 @@
           </w:tcPr>
           <w:p>
             <w:r>
-              <w:t>Jairo Calderón</w:t>
+              <w:t>Sawyer Lusk</w:t>
             </w:r>
           </w:p>
         </w:tc>
@@ -133,7 +133,7 @@
           </w:tcPr>
           <w:p>
             <w:r>
-              <w:t>Fourth (fourth for his old club in 2026)</w:t>
+              <w:t>Fifth (fourth for his old club in 2026)</w:t>
             </w:r>
           </w:p>
         </w:tc>
@@ -146,7 +146,7 @@
               <w:jc w:val="right"/>
             </w:pPr>
             <w:r>
-              <w:t>$700,000</w:t>
+              <w:t>$500,000</w:t>
             </w:r>
           </w:p>
         </w:tc>
@@ -158,7 +158,7 @@
           </w:tcPr>
           <w:p>
             <w:r>
-              <w:t>Kevin Weeks</w:t>
+              <w:t>Andres Rivas</w:t>
             </w:r>
           </w:p>
         </w:tc>
@@ -178,7 +178,7 @@
           </w:tcPr>
           <w:p>
             <w:r>
-              <w:t>Fifth (second for his old club in 2026)</w:t>
+              <w:t>Sixth (second for his old club in 2026)</w:t>
             </w:r>
           </w:p>
         </w:tc>
@@ -191,7 +191,7 @@
               <w:jc w:val="right"/>
             </w:pPr>
             <w:r>
-              <w:t>$800,000</w:t>
+              <w:t>$1,000,000</w:t>
             </w:r>
           </w:p>
         </w:tc>
@@ -203,7 +203,7 @@
           </w:tcPr>
           <w:p>
             <w:r>
-              <w:t>Ramon Figueroa</w:t>
+              <w:t>Drew Brock</w:t>
             </w:r>
           </w:p>
         </w:tc>
@@ -223,52 +223,7 @@
           </w:tcPr>
           <w:p>
             <w:r>
-              <w:t>Sixth (third for his old club in 2026)</w:t>
-            </w:r>
-          </w:p>
-        </w:tc>
-        <w:tc>
-          <w:tcPr>
-            <w:tcW w:type="dxa" w:w="2412"/>
-          </w:tcPr>
-          <w:p>
-            <w:pPr>
-              <w:jc w:val="right"/>
-            </w:pPr>
-            <w:r>
-              <w:t>$800,000</w:t>
-            </w:r>
-          </w:p>
-        </w:tc>
-      </w:tr>
-      <w:tr>
-        <w:tc>
-          <w:tcPr>
-            <w:tcW w:type="dxa" w:w="2412"/>
-          </w:tcPr>
-          <w:p>
-            <w:r>
-              <w:t>Eric Dobbs</w:t>
-            </w:r>
-          </w:p>
-        </w:tc>
-        <w:tc>
-          <w:tcPr>
-            <w:tcW w:type="dxa" w:w="2412"/>
-          </w:tcPr>
-          <w:p>
-            <w:r>
-              <w:t>December 8, 2026</w:t>
-            </w:r>
-          </w:p>
-        </w:tc>
-        <w:tc>
-          <w:tcPr>
-            <w:tcW w:type="dxa" w:w="2412"/>
-          </w:tcPr>
-          <w:p>
-            <w:r>
-              <w:t>Seventh (first for his old club in 2026)</w:t>
+              <w:t>Seventh (third for his old club in 2026)</w:t>
             </w:r>
           </w:p>
         </w:tc>
@@ -293,7 +248,52 @@
           </w:tcPr>
           <w:p>
             <w:r>
-              <w:t>Dylan Harlow</w:t>
+              <w:t>Ángel Medina</w:t>
+            </w:r>
+          </w:p>
+        </w:tc>
+        <w:tc>
+          <w:tcPr>
+            <w:tcW w:type="dxa" w:w="2412"/>
+          </w:tcPr>
+          <w:p>
+            <w:r>
+              <w:t>December 8, 2026</w:t>
+            </w:r>
+          </w:p>
+        </w:tc>
+        <w:tc>
+          <w:tcPr>
+            <w:tcW w:type="dxa" w:w="2412"/>
+          </w:tcPr>
+          <w:p>
+            <w:r>
+              <w:t>Eighth (first for his old club in 2026)</w:t>
+            </w:r>
+          </w:p>
+        </w:tc>
+        <w:tc>
+          <w:tcPr>
+            <w:tcW w:type="dxa" w:w="2412"/>
+          </w:tcPr>
+          <w:p>
+            <w:pPr>
+              <w:jc w:val="right"/>
+            </w:pPr>
+            <w:r>
+              <w:t>$1,200,000</w:t>
+            </w:r>
+          </w:p>
+        </w:tc>
+      </w:tr>
+      <w:tr>
+        <w:tc>
+          <w:tcPr>
+            <w:tcW w:type="dxa" w:w="2412"/>
+          </w:tcPr>
+          <w:p>
+            <w:r>
+              <w:t>Mike Meeks</w:t>
             </w:r>
           </w:p>
         </w:tc>
@@ -326,7 +326,7 @@
               <w:jc w:val="right"/>
             </w:pPr>
             <w:r>
-              <w:t>$600,000</w:t>
+              <w:t>$900,000</w:t>
             </w:r>
           </w:p>
         </w:tc>
@@ -363,7 +363,7 @@
               <w:jc w:val="right"/>
             </w:pPr>
             <w:r>
-              <w:t>$3,500,000</w:t>
+              <w:t>$4,250,000</w:t>
             </w:r>
           </w:p>
         </w:tc>
@@ -380,12 +380,12 @@
     </w:p>
     <w:p>
       <w:r>
-        <w:t>Basis for the probabilities. A player's plate appearances are his starts times the plate appearances his slot comes up per start, which in the League's 2021 to 2026 box scores fall from 4.73 batting first to 3.84 batting ninth. A regular's season is either close to a full season of starts or one long injured-list absence, some of it before Opening Day. Each bonus's probability is therefore the share of the 1,440 seasons of the non-catcher regulars in the projection vendor's January 31 depth charts, 2021 to 2026, whose starts at the player's 2027 slot reach the threshold. Player figures are rounded to the nearest $100,000 and the total to the nearest $250,000.</w:t>
+        <w:t>Basis for the probabilities (FIN-14 4.4). We scored each basis on the 748 hitter-seasons of 2023 to 2026 the policy names, each basis given only what was published before the season. The lowest score went to the share of the 1,440 seasons of the non-catcher regulars in the vendor's January 31 depth charts, 2021 to 2026, whose starts, times the plate appearances per start of the player's 2027 slot, reach the threshold; plate appearances per start fall from 4.72 batting first to 3.83 batting ninth. The vendor's projection with a band from its past misses scored 30.3% worse and would have accrued $6,250,000; the players' own last three seasons scored 56.0% worse.</w:t>
       </w:r>
     </w:p>
     <w:p>
       <w:r>
-        <w:t>The vendor's December 1 projections are not used: they carry each player's recent seasons at his old club, four of the five higher in the order than we plan to bat them, and a band around a projection spreads a season evenly where a regular's season is lumpy. The accrual is remeasured at each 2027 quarter end (FIN-14 4.4); the workbook pa_bonus_accrual_2027.xlsx carries each bonus line.</w:t>
+        <w:t>The five come to us off full seasons batting higher for their old clubs; each will bat lower here, and a regular's next season does not follow his last ones. Player figures are rounded to the nearest $100,000 and the total to the nearest $250,000 from the unrounded amounts (FIN-14 6), so the player figures add to $4,200,000. The accrual is remeasured at each 2027 quarter end (FIN-14 4.5); pa_bonus_accrual_2027.xlsx carries each bonus line and the look-back.</w:t>
       </w:r>
     </w:p>
     <w:p>

</xml_diff>